<commit_message>
STEP 5, 6 & 7
</commit_message>
<xml_diff>
--- a/lab3/Checkpoints.docx
+++ b/lab3/Checkpoints.docx
@@ -8,24 +8,14 @@
       </w:r>
       <w:r>
         <w:tab/>
-        <w:t xml:space="preserve">Reg. </w:t>
-      </w:r>
-      <w:proofErr w:type="gramStart"/>
-      <w:r>
-        <w:t>No:.</w:t>
-      </w:r>
-      <w:proofErr w:type="gramEnd"/>
-      <w:r>
-        <w:t xml:space="preserve"> 04072313007</w:t>
-      </w:r>
-    </w:p>
-    <w:p/>
-    <w:p>
-      <w:proofErr w:type="gramStart"/>
+        <w:t>Reg. No:. 04072313007</w:t>
+      </w:r>
+    </w:p>
+    <w:p/>
+    <w:p>
       <w:r>
         <w:t>SETUP :</w:t>
       </w:r>
-      <w:proofErr w:type="gramEnd"/>
     </w:p>
     <w:p/>
     <w:p>
@@ -40,15 +30,7 @@
     </w:p>
     <w:p>
       <w:r>
-        <w:t xml:space="preserve">const String </w:t>
-      </w:r>
-      <w:proofErr w:type="spellStart"/>
-      <w:r>
-        <w:t>rollNo</w:t>
-      </w:r>
-      <w:proofErr w:type="spellEnd"/>
-      <w:r>
-        <w:t xml:space="preserve"> = 'YOUR-ROLL-NO-HERE'; // e.g. '2100672347' </w:t>
+        <w:t xml:space="preserve">const String rollNo = 'YOUR-ROLL-NO-HERE'; // e.g. '2100672347' </w:t>
       </w:r>
     </w:p>
     <w:p>
@@ -58,33 +40,7 @@
     </w:p>
     <w:p>
       <w:r>
-        <w:t xml:space="preserve">final int seed = </w:t>
-      </w:r>
-      <w:proofErr w:type="spellStart"/>
-      <w:proofErr w:type="gramStart"/>
-      <w:r>
-        <w:t>int.parse</w:t>
-      </w:r>
-      <w:proofErr w:type="spellEnd"/>
-      <w:proofErr w:type="gramEnd"/>
-      <w:r>
-        <w:t>(</w:t>
-      </w:r>
-      <w:proofErr w:type="spellStart"/>
-      <w:r>
-        <w:t>rollNo.substring</w:t>
-      </w:r>
-      <w:proofErr w:type="spellEnd"/>
-      <w:r>
-        <w:t>(</w:t>
-      </w:r>
-      <w:proofErr w:type="spellStart"/>
-      <w:r>
-        <w:t>rollNo.length</w:t>
-      </w:r>
-      <w:proofErr w:type="spellEnd"/>
-      <w:r>
-        <w:t xml:space="preserve"> - 2)); </w:t>
+        <w:t xml:space="preserve">final int seed = int.parse(rollNo.substring(rollNo.length - 2)); </w:t>
       </w:r>
     </w:p>
     <w:p>
@@ -119,109 +75,32 @@
     </w:p>
     <w:p>
       <w:r>
-        <w:t xml:space="preserve">int </w:t>
-      </w:r>
-      <w:proofErr w:type="spellStart"/>
-      <w:proofErr w:type="gramStart"/>
-      <w:r>
-        <w:t>priceOf</w:t>
-      </w:r>
-      <w:proofErr w:type="spellEnd"/>
-      <w:r>
-        <w:t>(</w:t>
-      </w:r>
-      <w:proofErr w:type="gramEnd"/>
-      <w:r>
-        <w:t xml:space="preserve">int </w:t>
-      </w:r>
-      <w:proofErr w:type="spellStart"/>
-      <w:r>
-        <w:t>i</w:t>
-      </w:r>
-      <w:proofErr w:type="spellEnd"/>
-      <w:r>
-        <w:t xml:space="preserve">) =&gt; 100 + 7 * </w:t>
-      </w:r>
-      <w:proofErr w:type="spellStart"/>
-      <w:r>
-        <w:t>i</w:t>
-      </w:r>
-      <w:proofErr w:type="spellEnd"/>
-      <w:r>
-        <w:t xml:space="preserve"> + 3 * t; // price of menu[</w:t>
-      </w:r>
-      <w:proofErr w:type="spellStart"/>
-      <w:r>
-        <w:t>i</w:t>
-      </w:r>
-      <w:proofErr w:type="spellEnd"/>
-      <w:r>
-        <w:t xml:space="preserve">], in rupees </w:t>
-      </w:r>
-    </w:p>
-    <w:p>
-      <w:r>
-        <w:t xml:space="preserve">final int </w:t>
-      </w:r>
-      <w:proofErr w:type="spellStart"/>
-      <w:r>
-        <w:t>priceFloor</w:t>
-      </w:r>
-      <w:proofErr w:type="spellEnd"/>
-      <w:r>
-        <w:t xml:space="preserve"> = 60 + 5 * t; </w:t>
-      </w:r>
-    </w:p>
-    <w:p>
-      <w:r>
-        <w:t xml:space="preserve">final int </w:t>
-      </w:r>
-      <w:proofErr w:type="spellStart"/>
-      <w:r>
-        <w:t>taxPercent</w:t>
-      </w:r>
-      <w:proofErr w:type="spellEnd"/>
-      <w:r>
-        <w:t xml:space="preserve"> = 5 + t; </w:t>
-      </w:r>
-    </w:p>
-    <w:p>
-      <w:r>
-        <w:t xml:space="preserve">final int </w:t>
-      </w:r>
-      <w:proofErr w:type="spellStart"/>
-      <w:r>
-        <w:t>bigOrderLimit</w:t>
-      </w:r>
-      <w:proofErr w:type="spellEnd"/>
-      <w:r>
-        <w:t xml:space="preserve"> = 450 + 20 * t; </w:t>
-      </w:r>
-    </w:p>
-    <w:p>
-      <w:r>
-        <w:t xml:space="preserve">final int </w:t>
-      </w:r>
-      <w:proofErr w:type="spellStart"/>
-      <w:r>
-        <w:t>balanceCap</w:t>
-      </w:r>
-      <w:proofErr w:type="spellEnd"/>
-      <w:r>
-        <w:t xml:space="preserve"> = 600 + 20 * t; </w:t>
-      </w:r>
-    </w:p>
-    <w:p>
-      <w:r>
-        <w:t xml:space="preserve">final int </w:t>
-      </w:r>
-      <w:proofErr w:type="spellStart"/>
-      <w:r>
-        <w:t>couponPercent</w:t>
-      </w:r>
-      <w:proofErr w:type="spellEnd"/>
-      <w:r>
-        <w:t xml:space="preserve"> = 5 + t + u; </w:t>
+        <w:t xml:space="preserve">int priceOf(int i) =&gt; 100 + 7 * i + 3 * t; // price of menu[i], in rupees </w:t>
+      </w:r>
+    </w:p>
+    <w:p>
+      <w:r>
+        <w:t xml:space="preserve">final int priceFloor = 60 + 5 * t; </w:t>
+      </w:r>
+    </w:p>
+    <w:p>
+      <w:r>
+        <w:t xml:space="preserve">final int taxPercent = 5 + t; </w:t>
+      </w:r>
+    </w:p>
+    <w:p>
+      <w:r>
+        <w:t xml:space="preserve">final int bigOrderLimit = 450 + 20 * t; </w:t>
+      </w:r>
+    </w:p>
+    <w:p>
+      <w:r>
+        <w:t xml:space="preserve">final int balanceCap = 600 + 20 * t; </w:t>
+      </w:r>
+    </w:p>
+    <w:p>
+      <w:r>
+        <w:t xml:space="preserve">final int couponPercent = 5 + t + u; </w:t>
       </w:r>
     </w:p>
     <w:p>
@@ -231,25 +110,12 @@
     </w:p>
     <w:p>
       <w:r>
-        <w:t xml:space="preserve">void </w:t>
-      </w:r>
-      <w:proofErr w:type="gramStart"/>
-      <w:r>
-        <w:t>main(</w:t>
-      </w:r>
-      <w:proofErr w:type="gramEnd"/>
-      <w:r>
-        <w:t xml:space="preserve">) { </w:t>
-      </w:r>
-    </w:p>
-    <w:p>
-      <w:proofErr w:type="gramStart"/>
-      <w:r>
-        <w:t>print(</w:t>
-      </w:r>
-      <w:proofErr w:type="gramEnd"/>
-      <w:r>
-        <w:t xml:space="preserve">'Seed: $seed (t=$t, u=$u)'); </w:t>
+        <w:t xml:space="preserve">void main() { </w:t>
+      </w:r>
+    </w:p>
+    <w:p>
+      <w:r>
+        <w:t xml:space="preserve">print('Seed: $seed (t=$t, u=$u)'); </w:t>
       </w:r>
     </w:p>
     <w:p>
@@ -309,210 +175,53 @@
     </w:p>
     <w:p>
       <w:r>
-        <w:t xml:space="preserve">void step1() </w:t>
-      </w:r>
-      <w:proofErr w:type="gramStart"/>
-      <w:r>
-        <w:t>{ print</w:t>
-      </w:r>
-      <w:proofErr w:type="gramEnd"/>
-      <w:r>
-        <w:t>('--- Step 1 ---')</w:t>
-      </w:r>
-      <w:proofErr w:type="gramStart"/>
-      <w:r>
-        <w:t>; }</w:t>
-      </w:r>
-      <w:proofErr w:type="gramEnd"/>
-      <w:r>
-        <w:t xml:space="preserve"> </w:t>
-      </w:r>
-    </w:p>
-    <w:p>
-      <w:r>
-        <w:t xml:space="preserve">void step2() </w:t>
-      </w:r>
-      <w:proofErr w:type="gramStart"/>
-      <w:r>
-        <w:t>{ print</w:t>
-      </w:r>
-      <w:proofErr w:type="gramEnd"/>
-      <w:r>
-        <w:t>('--- Step 2 ---')</w:t>
-      </w:r>
-      <w:proofErr w:type="gramStart"/>
-      <w:r>
-        <w:t>; }</w:t>
-      </w:r>
-      <w:proofErr w:type="gramEnd"/>
-      <w:r>
-        <w:t xml:space="preserve"> </w:t>
-      </w:r>
-    </w:p>
-    <w:p>
-      <w:r>
-        <w:t xml:space="preserve">void step3() </w:t>
-      </w:r>
-      <w:proofErr w:type="gramStart"/>
-      <w:r>
-        <w:t>{ print</w:t>
-      </w:r>
-      <w:proofErr w:type="gramEnd"/>
-      <w:r>
-        <w:t>('--- Step 3 ---')</w:t>
-      </w:r>
-      <w:proofErr w:type="gramStart"/>
-      <w:r>
-        <w:t>; }</w:t>
-      </w:r>
-      <w:proofErr w:type="gramEnd"/>
-      <w:r>
-        <w:t xml:space="preserve"> </w:t>
-      </w:r>
-    </w:p>
-    <w:p>
-      <w:r>
-        <w:t xml:space="preserve">void step4() </w:t>
-      </w:r>
-      <w:proofErr w:type="gramStart"/>
-      <w:r>
-        <w:t>{ print</w:t>
-      </w:r>
-      <w:proofErr w:type="gramEnd"/>
-      <w:r>
-        <w:t>('--- Step 4 ---')</w:t>
-      </w:r>
-      <w:proofErr w:type="gramStart"/>
-      <w:r>
-        <w:t>; }</w:t>
-      </w:r>
-      <w:proofErr w:type="gramEnd"/>
-      <w:r>
-        <w:t xml:space="preserve"> </w:t>
-      </w:r>
-    </w:p>
-    <w:p>
-      <w:r>
-        <w:t xml:space="preserve">void step5() </w:t>
-      </w:r>
-      <w:proofErr w:type="gramStart"/>
-      <w:r>
-        <w:t>{ print</w:t>
-      </w:r>
-      <w:proofErr w:type="gramEnd"/>
-      <w:r>
-        <w:t>('--- Step 5 ---')</w:t>
-      </w:r>
-      <w:proofErr w:type="gramStart"/>
-      <w:r>
-        <w:t>; }</w:t>
-      </w:r>
-      <w:proofErr w:type="gramEnd"/>
-      <w:r>
-        <w:t xml:space="preserve"> </w:t>
-      </w:r>
-    </w:p>
-    <w:p>
-      <w:r>
-        <w:t xml:space="preserve">void step6() </w:t>
-      </w:r>
-      <w:proofErr w:type="gramStart"/>
-      <w:r>
-        <w:t>{ print</w:t>
-      </w:r>
-      <w:proofErr w:type="gramEnd"/>
-      <w:r>
-        <w:t>('--- Step 6 ---')</w:t>
-      </w:r>
-      <w:proofErr w:type="gramStart"/>
-      <w:r>
-        <w:t>; }</w:t>
-      </w:r>
-      <w:proofErr w:type="gramEnd"/>
-      <w:r>
-        <w:t xml:space="preserve"> </w:t>
-      </w:r>
-    </w:p>
-    <w:p>
-      <w:r>
-        <w:t xml:space="preserve">void step7() </w:t>
-      </w:r>
-      <w:proofErr w:type="gramStart"/>
-      <w:r>
-        <w:t>{ print</w:t>
-      </w:r>
-      <w:proofErr w:type="gramEnd"/>
-      <w:r>
-        <w:t>('--- Step 7 ---')</w:t>
-      </w:r>
-      <w:proofErr w:type="gramStart"/>
-      <w:r>
-        <w:t>; }</w:t>
-      </w:r>
-      <w:proofErr w:type="gramEnd"/>
-      <w:r>
-        <w:t xml:space="preserve"> </w:t>
-      </w:r>
-    </w:p>
-    <w:p>
-      <w:r>
-        <w:t xml:space="preserve">void step8() </w:t>
-      </w:r>
-      <w:proofErr w:type="gramStart"/>
-      <w:r>
-        <w:t>{ print</w:t>
-      </w:r>
-      <w:proofErr w:type="gramEnd"/>
-      <w:r>
-        <w:t>('--- Step 8 ---')</w:t>
-      </w:r>
-      <w:proofErr w:type="gramStart"/>
-      <w:r>
-        <w:t>; }</w:t>
-      </w:r>
-      <w:proofErr w:type="gramEnd"/>
-      <w:r>
-        <w:t xml:space="preserve"> </w:t>
-      </w:r>
-    </w:p>
-    <w:p>
-      <w:r>
-        <w:t xml:space="preserve">void step9() </w:t>
-      </w:r>
-      <w:proofErr w:type="gramStart"/>
-      <w:r>
-        <w:t>{ print</w:t>
-      </w:r>
-      <w:proofErr w:type="gramEnd"/>
-      <w:r>
-        <w:t>('--- Step 9 ---')</w:t>
-      </w:r>
-      <w:proofErr w:type="gramStart"/>
-      <w:r>
-        <w:t>; }</w:t>
-      </w:r>
-      <w:proofErr w:type="gramEnd"/>
-      <w:r>
-        <w:t xml:space="preserve"> </w:t>
-      </w:r>
-    </w:p>
-    <w:p>
-      <w:r>
-        <w:t xml:space="preserve">void step10() </w:t>
-      </w:r>
-      <w:proofErr w:type="gramStart"/>
-      <w:r>
-        <w:t>{ print</w:t>
-      </w:r>
-      <w:proofErr w:type="gramEnd"/>
-      <w:r>
-        <w:t>('--- Step 10 ---')</w:t>
-      </w:r>
-      <w:proofErr w:type="gramStart"/>
-      <w:r>
-        <w:t>; }</w:t>
-      </w:r>
-      <w:proofErr w:type="gramEnd"/>
+        <w:t xml:space="preserve">void step1() { print('--- Step 1 ---'); } </w:t>
+      </w:r>
+    </w:p>
+    <w:p>
+      <w:r>
+        <w:t xml:space="preserve">void step2() { print('--- Step 2 ---'); } </w:t>
+      </w:r>
+    </w:p>
+    <w:p>
+      <w:r>
+        <w:t xml:space="preserve">void step3() { print('--- Step 3 ---'); } </w:t>
+      </w:r>
+    </w:p>
+    <w:p>
+      <w:r>
+        <w:t xml:space="preserve">void step4() { print('--- Step 4 ---'); } </w:t>
+      </w:r>
+    </w:p>
+    <w:p>
+      <w:r>
+        <w:t xml:space="preserve">void step5() { print('--- Step 5 ---'); } </w:t>
+      </w:r>
+    </w:p>
+    <w:p>
+      <w:r>
+        <w:t xml:space="preserve">void step6() { print('--- Step 6 ---'); } </w:t>
+      </w:r>
+    </w:p>
+    <w:p>
+      <w:r>
+        <w:t xml:space="preserve">void step7() { print('--- Step 7 ---'); } </w:t>
+      </w:r>
+    </w:p>
+    <w:p>
+      <w:r>
+        <w:t xml:space="preserve">void step8() { print('--- Step 8 ---'); } </w:t>
+      </w:r>
+    </w:p>
+    <w:p>
+      <w:r>
+        <w:t xml:space="preserve">void step9() { print('--- Step 9 ---'); } </w:t>
+      </w:r>
+    </w:p>
+    <w:p>
+      <w:r>
+        <w:t>void step10() { print('--- Step 10 ---'); }</w:t>
+      </w:r>
       <w:r>
         <w:br/>
       </w:r>
@@ -553,124 +262,39 @@
     </w:p>
     <w:p>
       <w:r>
-        <w:t xml:space="preserve">  </w:t>
-      </w:r>
-      <w:proofErr w:type="gramStart"/>
-      <w:r>
-        <w:t>print(</w:t>
-      </w:r>
-      <w:proofErr w:type="gramEnd"/>
-      <w:r>
-        <w:t>'--- Step 1 ---');</w:t>
-      </w:r>
-    </w:p>
-    <w:p/>
-    <w:p>
-      <w:r>
-        <w:t xml:space="preserve">  final item1 = </w:t>
-      </w:r>
-      <w:proofErr w:type="gramStart"/>
-      <w:r>
-        <w:t>Dish(</w:t>
-      </w:r>
-      <w:proofErr w:type="gramEnd"/>
-      <w:r>
-        <w:t>)</w:t>
-      </w:r>
-    </w:p>
-    <w:p>
-      <w:r>
-        <w:t xml:space="preserve">    </w:t>
-      </w:r>
-      <w:proofErr w:type="gramStart"/>
-      <w:r>
-        <w:t>..</w:t>
-      </w:r>
-      <w:proofErr w:type="gramEnd"/>
-      <w:r>
-        <w:t>name = menu[u]</w:t>
-      </w:r>
-    </w:p>
-    <w:p>
-      <w:r>
-        <w:t xml:space="preserve">    </w:t>
-      </w:r>
-      <w:proofErr w:type="gramStart"/>
-      <w:r>
-        <w:t>..</w:t>
-      </w:r>
-      <w:proofErr w:type="gramEnd"/>
-      <w:r>
-        <w:t xml:space="preserve">price = </w:t>
-      </w:r>
-      <w:proofErr w:type="spellStart"/>
-      <w:r>
-        <w:t>priceOf</w:t>
-      </w:r>
-      <w:proofErr w:type="spellEnd"/>
-      <w:r>
-        <w:t>(u);</w:t>
-      </w:r>
-    </w:p>
-    <w:p/>
-    <w:p>
-      <w:r>
-        <w:t xml:space="preserve">  final item2 = </w:t>
-      </w:r>
-      <w:proofErr w:type="gramStart"/>
-      <w:r>
-        <w:t>Dish(</w:t>
-      </w:r>
-      <w:proofErr w:type="gramEnd"/>
-      <w:r>
-        <w:t>)</w:t>
-      </w:r>
-    </w:p>
-    <w:p>
-      <w:r>
-        <w:t xml:space="preserve">    </w:t>
-      </w:r>
-      <w:proofErr w:type="gramStart"/>
-      <w:r>
-        <w:t>..</w:t>
-      </w:r>
-      <w:proofErr w:type="gramEnd"/>
-      <w:r>
-        <w:t xml:space="preserve">name = </w:t>
-      </w:r>
-      <w:proofErr w:type="gramStart"/>
-      <w:r>
-        <w:t>menu[</w:t>
-      </w:r>
-      <w:proofErr w:type="gramEnd"/>
-      <w:r>
-        <w:t>(u + 1) % 10]</w:t>
-      </w:r>
-    </w:p>
-    <w:p>
-      <w:r>
-        <w:t xml:space="preserve">    </w:t>
-      </w:r>
-      <w:proofErr w:type="gramStart"/>
-      <w:r>
-        <w:t>..</w:t>
-      </w:r>
-      <w:proofErr w:type="gramEnd"/>
-      <w:r>
-        <w:t xml:space="preserve">price = </w:t>
-      </w:r>
-      <w:proofErr w:type="spellStart"/>
-      <w:proofErr w:type="gramStart"/>
-      <w:r>
-        <w:t>priceOf</w:t>
-      </w:r>
-      <w:proofErr w:type="spellEnd"/>
-      <w:r>
-        <w:t>(</w:t>
-      </w:r>
-      <w:proofErr w:type="gramEnd"/>
-      <w:r>
-        <w:t>(u + 1) % 10);</w:t>
+        <w:t>  print('--- Step 1 ---');</w:t>
+      </w:r>
+    </w:p>
+    <w:p/>
+    <w:p>
+      <w:r>
+        <w:t>  final item1 = Dish()</w:t>
+      </w:r>
+    </w:p>
+    <w:p>
+      <w:r>
+        <w:t>    ..name = menu[u]</w:t>
+      </w:r>
+    </w:p>
+    <w:p>
+      <w:r>
+        <w:t>    ..price = priceOf(u);</w:t>
+      </w:r>
+    </w:p>
+    <w:p/>
+    <w:p>
+      <w:r>
+        <w:t>  final item2 = Dish()</w:t>
+      </w:r>
+    </w:p>
+    <w:p>
+      <w:r>
+        <w:t>    ..name = menu[(u + 1) % 10]</w:t>
+      </w:r>
+    </w:p>
+    <w:p>
+      <w:r>
+        <w:t>    ..price = priceOf((u + 1) % 10);</w:t>
       </w:r>
     </w:p>
     <w:p/>
@@ -682,28 +306,12 @@
     <w:p/>
     <w:p>
       <w:r>
-        <w:t xml:space="preserve">  </w:t>
-      </w:r>
-      <w:proofErr w:type="gramStart"/>
-      <w:r>
-        <w:t>print(</w:t>
-      </w:r>
-      <w:proofErr w:type="gramEnd"/>
-      <w:r>
-        <w:t>'Step 1: ${item1.name} Rs ${item1.price}');</w:t>
-      </w:r>
-    </w:p>
-    <w:p>
-      <w:r>
-        <w:t xml:space="preserve">  </w:t>
-      </w:r>
-      <w:proofErr w:type="gramStart"/>
-      <w:r>
-        <w:t>print(</w:t>
-      </w:r>
-      <w:proofErr w:type="gramEnd"/>
-      <w:r>
-        <w:t>'Step 1: ${item2.name} Rs ${item2.price}');</w:t>
+        <w:t>  print('Step 1: ${item1.name} Rs ${item1.price}');</w:t>
+      </w:r>
+    </w:p>
+    <w:p>
+      <w:r>
+        <w:t>  print('Step 1: ${item2.name} Rs ${item2.price}');</w:t>
       </w:r>
     </w:p>
     <w:p>
@@ -773,15 +381,7 @@
     <w:p/>
     <w:p>
       <w:r>
-        <w:t xml:space="preserve">class </w:t>
-      </w:r>
-      <w:proofErr w:type="spellStart"/>
-      <w:r>
-        <w:t>MenuItem</w:t>
-      </w:r>
-      <w:proofErr w:type="spellEnd"/>
-      <w:r>
-        <w:t xml:space="preserve"> {</w:t>
+        <w:t>class MenuItem {</w:t>
       </w:r>
     </w:p>
     <w:p>
@@ -797,76 +397,17 @@
     <w:p/>
     <w:p>
       <w:r>
-        <w:t xml:space="preserve">  </w:t>
-      </w:r>
-      <w:proofErr w:type="spellStart"/>
-      <w:proofErr w:type="gramStart"/>
-      <w:r>
-        <w:t>MenuItem</w:t>
-      </w:r>
-      <w:proofErr w:type="spellEnd"/>
-      <w:r>
-        <w:t>(</w:t>
-      </w:r>
-      <w:proofErr w:type="gramEnd"/>
-      <w:r>
-        <w:t xml:space="preserve">this.name, </w:t>
-      </w:r>
-      <w:proofErr w:type="spellStart"/>
-      <w:proofErr w:type="gramStart"/>
-      <w:r>
-        <w:t>this.price</w:t>
-      </w:r>
-      <w:proofErr w:type="spellEnd"/>
-      <w:proofErr w:type="gramEnd"/>
-      <w:r>
-        <w:t>) {</w:t>
-      </w:r>
-    </w:p>
-    <w:p>
-      <w:r>
-        <w:t>    if (</w:t>
-      </w:r>
-      <w:proofErr w:type="spellStart"/>
-      <w:proofErr w:type="gramStart"/>
-      <w:r>
-        <w:t>this.price</w:t>
-      </w:r>
-      <w:proofErr w:type="spellEnd"/>
-      <w:proofErr w:type="gramEnd"/>
-      <w:r>
-        <w:t xml:space="preserve"> &lt; </w:t>
-      </w:r>
-      <w:proofErr w:type="spellStart"/>
-      <w:r>
-        <w:t>priceFloor</w:t>
-      </w:r>
-      <w:proofErr w:type="spellEnd"/>
-      <w:r>
-        <w:t>) {</w:t>
-      </w:r>
-    </w:p>
-    <w:p>
-      <w:r>
-        <w:t xml:space="preserve">      </w:t>
-      </w:r>
-      <w:proofErr w:type="spellStart"/>
-      <w:proofErr w:type="gramStart"/>
-      <w:r>
-        <w:t>this.price</w:t>
-      </w:r>
-      <w:proofErr w:type="spellEnd"/>
-      <w:proofErr w:type="gramEnd"/>
-      <w:r>
-        <w:t xml:space="preserve"> = </w:t>
-      </w:r>
-      <w:proofErr w:type="spellStart"/>
-      <w:r>
-        <w:t>priceFloor</w:t>
-      </w:r>
-      <w:proofErr w:type="spellEnd"/>
-      <w:r>
-        <w:t>;</w:t>
+        <w:t>  MenuItem(this.name, this.price) {</w:t>
+      </w:r>
+    </w:p>
+    <w:p>
+      <w:r>
+        <w:t>    if (this.price &lt; priceFloor) {</w:t>
+      </w:r>
+    </w:p>
+    <w:p>
+      <w:r>
+        <w:t>      this.price = priceFloor;</w:t>
       </w:r>
     </w:p>
     <w:p>
@@ -898,101 +439,28 @@
     </w:p>
     <w:p>
       <w:r>
-        <w:t xml:space="preserve">  </w:t>
-      </w:r>
-      <w:proofErr w:type="gramStart"/>
-      <w:r>
-        <w:t>print(</w:t>
-      </w:r>
-      <w:proofErr w:type="gramEnd"/>
-      <w:r>
-        <w:t>'--- Step 2 ---');</w:t>
-      </w:r>
-    </w:p>
-    <w:p>
-      <w:r>
-        <w:t xml:space="preserve">  final a = </w:t>
-      </w:r>
-      <w:proofErr w:type="spellStart"/>
-      <w:r>
-        <w:t>MenuItem</w:t>
-      </w:r>
-      <w:proofErr w:type="spellEnd"/>
-      <w:r>
-        <w:t xml:space="preserve">(menu[u], </w:t>
-      </w:r>
-      <w:proofErr w:type="spellStart"/>
-      <w:r>
-        <w:t>priceOf</w:t>
-      </w:r>
-      <w:proofErr w:type="spellEnd"/>
-      <w:r>
-        <w:t>(u));</w:t>
-      </w:r>
-    </w:p>
-    <w:p>
-      <w:r>
-        <w:t xml:space="preserve">  final b = </w:t>
-      </w:r>
-      <w:proofErr w:type="spellStart"/>
-      <w:proofErr w:type="gramStart"/>
-      <w:r>
-        <w:t>MenuItem</w:t>
-      </w:r>
-      <w:proofErr w:type="spellEnd"/>
-      <w:r>
-        <w:t>(</w:t>
-      </w:r>
-      <w:proofErr w:type="gramEnd"/>
-      <w:r>
-        <w:t>'Test Special', 15 * u);</w:t>
-      </w:r>
-    </w:p>
-    <w:p/>
-    <w:p>
-      <w:r>
-        <w:t xml:space="preserve">  </w:t>
-      </w:r>
-      <w:proofErr w:type="gramStart"/>
-      <w:r>
-        <w:t>print(</w:t>
-      </w:r>
-      <w:proofErr w:type="gramEnd"/>
-      <w:r>
-        <w:t>'Step 2: ${a.name} Rs ${</w:t>
-      </w:r>
-      <w:proofErr w:type="spellStart"/>
-      <w:proofErr w:type="gramStart"/>
-      <w:r>
-        <w:t>a.price</w:t>
-      </w:r>
-      <w:proofErr w:type="spellEnd"/>
-      <w:proofErr w:type="gramEnd"/>
-      <w:r>
-        <w:t>}');</w:t>
-      </w:r>
-    </w:p>
-    <w:p>
-      <w:r>
-        <w:t xml:space="preserve">  </w:t>
-      </w:r>
-      <w:proofErr w:type="gramStart"/>
-      <w:r>
-        <w:t>print(</w:t>
-      </w:r>
-      <w:proofErr w:type="gramEnd"/>
-      <w:r>
-        <w:t>'Step 2: Test Special Rs ${</w:t>
-      </w:r>
-      <w:proofErr w:type="spellStart"/>
-      <w:proofErr w:type="gramStart"/>
-      <w:r>
-        <w:t>b.price</w:t>
-      </w:r>
-      <w:proofErr w:type="spellEnd"/>
-      <w:proofErr w:type="gramEnd"/>
-      <w:r>
-        <w:t>}');</w:t>
+        <w:t>  print('--- Step 2 ---');</w:t>
+      </w:r>
+    </w:p>
+    <w:p>
+      <w:r>
+        <w:t>  final a = MenuItem(menu[u], priceOf(u));</w:t>
+      </w:r>
+    </w:p>
+    <w:p>
+      <w:r>
+        <w:t>  final b = MenuItem('Test Special', 15 * u);</w:t>
+      </w:r>
+    </w:p>
+    <w:p/>
+    <w:p>
+      <w:r>
+        <w:t>  print('Step 2: ${a.name} Rs ${a.price}');</w:t>
+      </w:r>
+    </w:p>
+    <w:p>
+      <w:r>
+        <w:t>  print('Step 2: Test Special Rs ${b.price}');</w:t>
       </w:r>
     </w:p>
     <w:p>
@@ -1049,15 +517,7 @@
     </w:p>
     <w:p>
       <w:r>
-        <w:t xml:space="preserve">class </w:t>
-      </w:r>
-      <w:proofErr w:type="spellStart"/>
-      <w:r>
-        <w:t>MenuItem</w:t>
-      </w:r>
-      <w:proofErr w:type="spellEnd"/>
-      <w:r>
-        <w:t xml:space="preserve"> {</w:t>
+        <w:t>class MenuItem {</w:t>
       </w:r>
     </w:p>
     <w:p>
@@ -1073,76 +533,17 @@
     <w:p/>
     <w:p>
       <w:r>
-        <w:t xml:space="preserve">  </w:t>
-      </w:r>
-      <w:proofErr w:type="spellStart"/>
-      <w:proofErr w:type="gramStart"/>
-      <w:r>
-        <w:t>MenuItem</w:t>
-      </w:r>
-      <w:proofErr w:type="spellEnd"/>
-      <w:r>
-        <w:t>(</w:t>
-      </w:r>
-      <w:proofErr w:type="gramEnd"/>
-      <w:r>
-        <w:t xml:space="preserve">this.name, </w:t>
-      </w:r>
-      <w:proofErr w:type="spellStart"/>
-      <w:proofErr w:type="gramStart"/>
-      <w:r>
-        <w:t>this.price</w:t>
-      </w:r>
-      <w:proofErr w:type="spellEnd"/>
-      <w:proofErr w:type="gramEnd"/>
-      <w:r>
-        <w:t>) {</w:t>
-      </w:r>
-    </w:p>
-    <w:p>
-      <w:r>
-        <w:t>    if (</w:t>
-      </w:r>
-      <w:proofErr w:type="spellStart"/>
-      <w:proofErr w:type="gramStart"/>
-      <w:r>
-        <w:t>this.price</w:t>
-      </w:r>
-      <w:proofErr w:type="spellEnd"/>
-      <w:proofErr w:type="gramEnd"/>
-      <w:r>
-        <w:t xml:space="preserve"> &lt; </w:t>
-      </w:r>
-      <w:proofErr w:type="spellStart"/>
-      <w:r>
-        <w:t>priceFloor</w:t>
-      </w:r>
-      <w:proofErr w:type="spellEnd"/>
-      <w:r>
-        <w:t>) {</w:t>
-      </w:r>
-    </w:p>
-    <w:p>
-      <w:r>
-        <w:t xml:space="preserve">      </w:t>
-      </w:r>
-      <w:proofErr w:type="spellStart"/>
-      <w:proofErr w:type="gramStart"/>
-      <w:r>
-        <w:t>this.price</w:t>
-      </w:r>
-      <w:proofErr w:type="spellEnd"/>
-      <w:proofErr w:type="gramEnd"/>
-      <w:r>
-        <w:t xml:space="preserve"> = </w:t>
-      </w:r>
-      <w:proofErr w:type="spellStart"/>
-      <w:r>
-        <w:t>priceFloor</w:t>
-      </w:r>
-      <w:proofErr w:type="spellEnd"/>
-      <w:r>
-        <w:t>;</w:t>
+        <w:t>  MenuItem(this.name, this.price) {</w:t>
+      </w:r>
+    </w:p>
+    <w:p>
+      <w:r>
+        <w:t>    if (this.price &lt; priceFloor) {</w:t>
+      </w:r>
+    </w:p>
+    <w:p>
+      <w:r>
+        <w:t>      this.price = priceFloor;</w:t>
       </w:r>
     </w:p>
     <w:p>
@@ -1158,93 +559,23 @@
     <w:p/>
     <w:p>
       <w:r>
-        <w:t xml:space="preserve">  </w:t>
-      </w:r>
-      <w:proofErr w:type="spellStart"/>
-      <w:r>
-        <w:t>MenuItem.free</w:t>
-      </w:r>
-      <w:proofErr w:type="spellEnd"/>
-      <w:r>
-        <w:t>(this.name</w:t>
-      </w:r>
-      <w:proofErr w:type="gramStart"/>
-      <w:r>
-        <w:t>) :</w:t>
-      </w:r>
-      <w:proofErr w:type="gramEnd"/>
-      <w:r>
-        <w:t xml:space="preserve"> price = 0;</w:t>
-      </w:r>
-    </w:p>
-    <w:p/>
-    <w:p>
-      <w:r>
-        <w:t xml:space="preserve">  </w:t>
-      </w:r>
-      <w:proofErr w:type="spellStart"/>
-      <w:r>
-        <w:t>MenuItem.fromString</w:t>
-      </w:r>
-      <w:proofErr w:type="spellEnd"/>
-      <w:r>
-        <w:t>(String text)</w:t>
-      </w:r>
-    </w:p>
-    <w:p>
-      <w:r>
-        <w:t xml:space="preserve">      : name = </w:t>
-      </w:r>
-      <w:proofErr w:type="spellStart"/>
-      <w:proofErr w:type="gramStart"/>
-      <w:r>
-        <w:t>text.split</w:t>
-      </w:r>
-      <w:proofErr w:type="spellEnd"/>
-      <w:proofErr w:type="gramEnd"/>
-      <w:r>
-        <w:t>(':</w:t>
-      </w:r>
-      <w:proofErr w:type="gramStart"/>
-      <w:r>
-        <w:t>')[</w:t>
-      </w:r>
-      <w:proofErr w:type="gramEnd"/>
-      <w:r>
-        <w:t>0],</w:t>
-      </w:r>
-    </w:p>
-    <w:p>
-      <w:r>
-        <w:t xml:space="preserve">        price = </w:t>
-      </w:r>
-      <w:proofErr w:type="spellStart"/>
-      <w:proofErr w:type="gramStart"/>
-      <w:r>
-        <w:t>int.parse</w:t>
-      </w:r>
-      <w:proofErr w:type="spellEnd"/>
-      <w:proofErr w:type="gramEnd"/>
-      <w:r>
-        <w:t>(</w:t>
-      </w:r>
-      <w:proofErr w:type="spellStart"/>
-      <w:proofErr w:type="gramStart"/>
-      <w:r>
-        <w:t>text.split</w:t>
-      </w:r>
-      <w:proofErr w:type="spellEnd"/>
-      <w:proofErr w:type="gramEnd"/>
-      <w:r>
-        <w:t>(':</w:t>
-      </w:r>
-      <w:proofErr w:type="gramStart"/>
-      <w:r>
-        <w:t>')[</w:t>
-      </w:r>
-      <w:proofErr w:type="gramEnd"/>
-      <w:r>
-        <w:t>1]);</w:t>
+        <w:t>  MenuItem.free(this.name) : price = 0;</w:t>
+      </w:r>
+    </w:p>
+    <w:p/>
+    <w:p>
+      <w:r>
+        <w:t>  MenuItem.fromString(String text)</w:t>
+      </w:r>
+    </w:p>
+    <w:p>
+      <w:r>
+        <w:t>      : name = text.split(':')[0],</w:t>
+      </w:r>
+    </w:p>
+    <w:p>
+      <w:r>
+        <w:t>        price = int.parse(text.split(':')[1]);</w:t>
       </w:r>
     </w:p>
     <w:p/>
@@ -1256,20 +587,7 @@
     <w:p>
       <w:r>
         <w:lastRenderedPageBreak/>
-        <w:t xml:space="preserve">  String </w:t>
-      </w:r>
-      <w:proofErr w:type="spellStart"/>
-      <w:proofErr w:type="gramStart"/>
-      <w:r>
-        <w:t>toString</w:t>
-      </w:r>
-      <w:proofErr w:type="spellEnd"/>
-      <w:r>
-        <w:t>(</w:t>
-      </w:r>
-      <w:proofErr w:type="gramEnd"/>
-      <w:r>
-        <w:t>) =&gt; '$name (Rs $price)';</w:t>
+        <w:t>  String toString() =&gt; '$name (Rs $price)';</w:t>
       </w:r>
     </w:p>
     <w:p>
@@ -1285,92 +603,28 @@
     </w:p>
     <w:p>
       <w:r>
-        <w:t xml:space="preserve">  </w:t>
-      </w:r>
-      <w:proofErr w:type="gramStart"/>
-      <w:r>
-        <w:t>print(</w:t>
-      </w:r>
-      <w:proofErr w:type="gramEnd"/>
-      <w:r>
-        <w:t>'--- Step 3 ---');</w:t>
-      </w:r>
-    </w:p>
-    <w:p/>
-    <w:p>
-      <w:r>
-        <w:t xml:space="preserve">  final freebie = </w:t>
-      </w:r>
-      <w:proofErr w:type="spellStart"/>
-      <w:r>
-        <w:t>MenuItem.free</w:t>
-      </w:r>
-      <w:proofErr w:type="spellEnd"/>
-      <w:r>
-        <w:t>('Water');</w:t>
-      </w:r>
-    </w:p>
-    <w:p>
-      <w:r>
-        <w:t xml:space="preserve">  final </w:t>
-      </w:r>
-      <w:proofErr w:type="spellStart"/>
-      <w:r>
-        <w:t>i</w:t>
-      </w:r>
-      <w:proofErr w:type="spellEnd"/>
-      <w:r>
-        <w:t xml:space="preserve"> = (u + 2) % 10;</w:t>
-      </w:r>
-    </w:p>
-    <w:p>
-      <w:r>
-        <w:t xml:space="preserve">  final parsed = </w:t>
-      </w:r>
-      <w:proofErr w:type="spellStart"/>
-      <w:r>
-        <w:t>MenuItem.fromString</w:t>
-      </w:r>
-      <w:proofErr w:type="spellEnd"/>
-      <w:r>
-        <w:t>(</w:t>
-      </w:r>
-    </w:p>
-    <w:p>
-      <w:r>
-        <w:t>    '${menu[</w:t>
-      </w:r>
-      <w:proofErr w:type="spellStart"/>
-      <w:r>
-        <w:t>i</w:t>
-      </w:r>
-      <w:proofErr w:type="spellEnd"/>
-      <w:r>
-        <w:t>]</w:t>
-      </w:r>
-      <w:proofErr w:type="gramStart"/>
-      <w:r>
-        <w:t>}:$</w:t>
-      </w:r>
-      <w:proofErr w:type="gramEnd"/>
-      <w:r>
-        <w:t>{</w:t>
-      </w:r>
-      <w:proofErr w:type="spellStart"/>
-      <w:r>
-        <w:t>priceOf</w:t>
-      </w:r>
-      <w:proofErr w:type="spellEnd"/>
-      <w:r>
-        <w:t>(</w:t>
-      </w:r>
-      <w:proofErr w:type="spellStart"/>
-      <w:r>
-        <w:t>i</w:t>
-      </w:r>
-      <w:proofErr w:type="spellEnd"/>
-      <w:r>
-        <w:t>)}',</w:t>
+        <w:t>  print('--- Step 3 ---');</w:t>
+      </w:r>
+    </w:p>
+    <w:p/>
+    <w:p>
+      <w:r>
+        <w:t>  final freebie = MenuItem.free('Water');</w:t>
+      </w:r>
+    </w:p>
+    <w:p>
+      <w:r>
+        <w:t>  final i = (u + 2) % 10;</w:t>
+      </w:r>
+    </w:p>
+    <w:p>
+      <w:r>
+        <w:t>  final parsed = MenuItem.fromString(</w:t>
+      </w:r>
+    </w:p>
+    <w:p>
+      <w:r>
+        <w:t>    '${menu[i]}:${priceOf(i)}',</w:t>
       </w:r>
     </w:p>
     <w:p>
@@ -1381,79 +635,17 @@
     <w:p/>
     <w:p>
       <w:r>
-        <w:t xml:space="preserve">  </w:t>
-      </w:r>
-      <w:proofErr w:type="gramStart"/>
-      <w:r>
-        <w:t>print(</w:t>
-      </w:r>
-      <w:proofErr w:type="gramEnd"/>
-      <w:r>
-        <w:t>'Step 3: ${freebie.name} Rs ${</w:t>
-      </w:r>
-      <w:proofErr w:type="spellStart"/>
-      <w:proofErr w:type="gramStart"/>
-      <w:r>
-        <w:t>freebie.price</w:t>
-      </w:r>
-      <w:proofErr w:type="spellEnd"/>
-      <w:proofErr w:type="gramEnd"/>
-      <w:r>
-        <w:t>}');</w:t>
-      </w:r>
-    </w:p>
-    <w:p>
-      <w:r>
-        <w:t xml:space="preserve">  </w:t>
-      </w:r>
-      <w:proofErr w:type="gramStart"/>
-      <w:r>
-        <w:t>print(</w:t>
-      </w:r>
-      <w:proofErr w:type="gramEnd"/>
-      <w:r>
-        <w:t>'Step 3: ${parsed.name} Rs ${</w:t>
-      </w:r>
-      <w:proofErr w:type="spellStart"/>
-      <w:proofErr w:type="gramStart"/>
-      <w:r>
-        <w:t>parsed.price</w:t>
-      </w:r>
-      <w:proofErr w:type="spellEnd"/>
-      <w:proofErr w:type="gramEnd"/>
-      <w:r>
-        <w:t>}');</w:t>
-      </w:r>
-    </w:p>
-    <w:p>
-      <w:r>
-        <w:t xml:space="preserve">  </w:t>
-      </w:r>
-      <w:proofErr w:type="gramStart"/>
-      <w:r>
-        <w:t>print(</w:t>
-      </w:r>
-      <w:proofErr w:type="gramEnd"/>
-      <w:r>
-        <w:t>'Step 3: floor=$</w:t>
-      </w:r>
-      <w:proofErr w:type="spellStart"/>
-      <w:r>
-        <w:t>priceFloor</w:t>
-      </w:r>
-      <w:proofErr w:type="spellEnd"/>
-      <w:r>
-        <w:t>, free price=${</w:t>
-      </w:r>
-      <w:proofErr w:type="spellStart"/>
-      <w:proofErr w:type="gramStart"/>
-      <w:r>
-        <w:t>freebie.price</w:t>
-      </w:r>
-      <w:proofErr w:type="spellEnd"/>
-      <w:proofErr w:type="gramEnd"/>
-      <w:r>
-        <w:t>}');</w:t>
+        <w:t>  print('Step 3: ${freebie.name} Rs ${freebie.price}');</w:t>
+      </w:r>
+    </w:p>
+    <w:p>
+      <w:r>
+        <w:t>  print('Step 3: ${parsed.name} Rs ${parsed.price}');</w:t>
+      </w:r>
+    </w:p>
+    <w:p>
+      <w:r>
+        <w:t>  print('Step 3: floor=$priceFloor, free price=${freebie.price}');</w:t>
       </w:r>
     </w:p>
     <w:p>
@@ -1511,28 +703,12 @@
     <w:p/>
     <w:p>
       <w:r>
-        <w:t xml:space="preserve">class </w:t>
-      </w:r>
-      <w:proofErr w:type="spellStart"/>
-      <w:r>
-        <w:t>OrderLog</w:t>
-      </w:r>
-      <w:proofErr w:type="spellEnd"/>
-      <w:r>
-        <w:t xml:space="preserve"> {</w:t>
-      </w:r>
-    </w:p>
-    <w:p>
-      <w:r>
-        <w:t xml:space="preserve">  static </w:t>
-      </w:r>
-      <w:proofErr w:type="spellStart"/>
-      <w:r>
-        <w:t>OrderLog</w:t>
-      </w:r>
-      <w:proofErr w:type="spellEnd"/>
-      <w:r>
-        <w:t>? _instance;</w:t>
+        <w:t>class OrderLog {</w:t>
+      </w:r>
+    </w:p>
+    <w:p>
+      <w:r>
+        <w:t>  static OrderLog? _instance;</w:t>
       </w:r>
     </w:p>
     <w:p>
@@ -1543,57 +719,18 @@
     <w:p/>
     <w:p>
       <w:r>
-        <w:t xml:space="preserve">  </w:t>
-      </w:r>
-      <w:proofErr w:type="spellStart"/>
-      <w:proofErr w:type="gramStart"/>
-      <w:r>
-        <w:t>OrderLog</w:t>
-      </w:r>
-      <w:proofErr w:type="spellEnd"/>
-      <w:r>
-        <w:t>._internal(</w:t>
-      </w:r>
-      <w:proofErr w:type="gramEnd"/>
-      <w:r>
-        <w:t>);</w:t>
-      </w:r>
-    </w:p>
-    <w:p/>
-    <w:p>
-      <w:r>
-        <w:t xml:space="preserve">  factory </w:t>
-      </w:r>
-      <w:proofErr w:type="spellStart"/>
-      <w:proofErr w:type="gramStart"/>
-      <w:r>
-        <w:t>OrderLog</w:t>
-      </w:r>
-      <w:proofErr w:type="spellEnd"/>
-      <w:r>
-        <w:t>(</w:t>
-      </w:r>
-      <w:proofErr w:type="gramEnd"/>
-      <w:r>
-        <w:t>) {</w:t>
-      </w:r>
-    </w:p>
-    <w:p>
-      <w:r>
-        <w:t xml:space="preserve">    return _instance ??= </w:t>
-      </w:r>
-      <w:proofErr w:type="spellStart"/>
-      <w:proofErr w:type="gramStart"/>
-      <w:r>
-        <w:t>OrderLog</w:t>
-      </w:r>
-      <w:proofErr w:type="spellEnd"/>
-      <w:r>
-        <w:t>._internal(</w:t>
-      </w:r>
-      <w:proofErr w:type="gramEnd"/>
-      <w:r>
-        <w:t>);</w:t>
+        <w:t>  OrderLog._internal();</w:t>
+      </w:r>
+    </w:p>
+    <w:p/>
+    <w:p>
+      <w:r>
+        <w:t>  factory OrderLog() {</w:t>
+      </w:r>
+    </w:p>
+    <w:p>
+      <w:r>
+        <w:t>    return _instance ??= OrderLog._internal();</w:t>
       </w:r>
     </w:p>
     <w:p>
@@ -1604,23 +741,7 @@
     <w:p/>
     <w:p>
       <w:r>
-        <w:t xml:space="preserve">  void </w:t>
-      </w:r>
-      <w:proofErr w:type="gramStart"/>
-      <w:r>
-        <w:t>add(</w:t>
-      </w:r>
-      <w:proofErr w:type="gramEnd"/>
-      <w:r>
-        <w:t xml:space="preserve">String msg) =&gt; </w:t>
-      </w:r>
-      <w:proofErr w:type="spellStart"/>
-      <w:r>
-        <w:t>entries.add</w:t>
-      </w:r>
-      <w:proofErr w:type="spellEnd"/>
-      <w:r>
-        <w:t>(msg);</w:t>
+        <w:t>  void add(String msg) =&gt; entries.add(msg);</w:t>
       </w:r>
     </w:p>
     <w:p>
@@ -1638,111 +759,35 @@
     </w:p>
     <w:p>
       <w:r>
-        <w:t xml:space="preserve">  </w:t>
-      </w:r>
-      <w:proofErr w:type="gramStart"/>
-      <w:r>
-        <w:t>print(</w:t>
-      </w:r>
-      <w:proofErr w:type="gramEnd"/>
-      <w:r>
-        <w:t>'--- Step 4 ---');</w:t>
-      </w:r>
-    </w:p>
-    <w:p/>
-    <w:p>
-      <w:r>
-        <w:t xml:space="preserve">  final log1 = </w:t>
-      </w:r>
-      <w:proofErr w:type="spellStart"/>
-      <w:proofErr w:type="gramStart"/>
-      <w:r>
-        <w:t>OrderLog</w:t>
-      </w:r>
-      <w:proofErr w:type="spellEnd"/>
-      <w:r>
-        <w:t>(</w:t>
-      </w:r>
-      <w:proofErr w:type="gramEnd"/>
-      <w:r>
-        <w:t>);</w:t>
-      </w:r>
-    </w:p>
-    <w:p>
-      <w:r>
-        <w:t xml:space="preserve">  final log2 = </w:t>
-      </w:r>
-      <w:proofErr w:type="spellStart"/>
-      <w:proofErr w:type="gramStart"/>
-      <w:r>
-        <w:t>OrderLog</w:t>
-      </w:r>
-      <w:proofErr w:type="spellEnd"/>
-      <w:r>
-        <w:t>(</w:t>
-      </w:r>
-      <w:proofErr w:type="gramEnd"/>
-      <w:r>
-        <w:t>);</w:t>
-      </w:r>
-    </w:p>
-    <w:p/>
-    <w:p>
-      <w:r>
-        <w:t xml:space="preserve">  for (int </w:t>
-      </w:r>
-      <w:proofErr w:type="spellStart"/>
-      <w:r>
-        <w:t>i</w:t>
-      </w:r>
-      <w:proofErr w:type="spellEnd"/>
-      <w:r>
-        <w:t xml:space="preserve"> = 1; </w:t>
-      </w:r>
-      <w:proofErr w:type="spellStart"/>
-      <w:r>
-        <w:t>i</w:t>
-      </w:r>
-      <w:proofErr w:type="spellEnd"/>
-      <w:r>
-        <w:t xml:space="preserve"> &lt;= u + 2; </w:t>
-      </w:r>
-      <w:proofErr w:type="spellStart"/>
-      <w:r>
-        <w:t>i</w:t>
-      </w:r>
-      <w:proofErr w:type="spellEnd"/>
-      <w:r>
-        <w:t>++) {</w:t>
-      </w:r>
-    </w:p>
-    <w:p>
-      <w:r>
-        <w:t xml:space="preserve">    final message = 'order #${100 * t + </w:t>
-      </w:r>
-      <w:proofErr w:type="spellStart"/>
-      <w:r>
-        <w:t>i</w:t>
-      </w:r>
-      <w:proofErr w:type="spellEnd"/>
-      <w:r>
-        <w:t>}';</w:t>
-      </w:r>
-    </w:p>
-    <w:p/>
-    <w:p>
-      <w:r>
-        <w:t>    if (</w:t>
-      </w:r>
-      <w:proofErr w:type="spellStart"/>
-      <w:proofErr w:type="gramStart"/>
-      <w:r>
-        <w:t>i.isOdd</w:t>
-      </w:r>
-      <w:proofErr w:type="spellEnd"/>
-      <w:proofErr w:type="gramEnd"/>
-      <w:r>
-        <w:t>) {</w:t>
+        <w:t>  print('--- Step 4 ---');</w:t>
+      </w:r>
+    </w:p>
+    <w:p/>
+    <w:p>
+      <w:r>
+        <w:t>  final log1 = OrderLog();</w:t>
+      </w:r>
+    </w:p>
+    <w:p>
+      <w:r>
+        <w:t>  final log2 = OrderLog();</w:t>
+      </w:r>
+    </w:p>
+    <w:p/>
+    <w:p>
+      <w:r>
+        <w:t>  for (int i = 1; i &lt;= u + 2; i++) {</w:t>
+      </w:r>
+    </w:p>
+    <w:p>
+      <w:r>
+        <w:t>    final message = 'order #${100 * t + i}';</w:t>
+      </w:r>
+    </w:p>
+    <w:p/>
+    <w:p>
+      <w:r>
+        <w:t>    if (i.isOdd) {</w:t>
       </w:r>
     </w:p>
     <w:p>
@@ -1772,65 +817,17 @@
     </w:p>
     <w:p>
       <w:r>
-        <w:t xml:space="preserve">  </w:t>
-      </w:r>
-      <w:proofErr w:type="gramStart"/>
-      <w:r>
-        <w:t>print(</w:t>
-      </w:r>
-      <w:proofErr w:type="gramEnd"/>
-      <w:r>
-        <w:t>'Step 4: same object? ${</w:t>
-      </w:r>
-      <w:proofErr w:type="gramStart"/>
-      <w:r>
-        <w:t>identical(</w:t>
-      </w:r>
-      <w:proofErr w:type="gramEnd"/>
-      <w:r>
-        <w:t>log1, log2)}');</w:t>
-      </w:r>
-    </w:p>
-    <w:p>
-      <w:r>
-        <w:t xml:space="preserve">  </w:t>
-      </w:r>
-      <w:proofErr w:type="gramStart"/>
-      <w:r>
-        <w:t>print(</w:t>
-      </w:r>
-      <w:proofErr w:type="gramEnd"/>
-      <w:r>
-        <w:t>'Step 4: entries = ${</w:t>
-      </w:r>
-      <w:proofErr w:type="gramStart"/>
-      <w:r>
-        <w:t>log1.entries.length</w:t>
-      </w:r>
-      <w:proofErr w:type="gramEnd"/>
-      <w:r>
-        <w:t>}');</w:t>
-      </w:r>
-    </w:p>
-    <w:p>
-      <w:r>
-        <w:t xml:space="preserve">  </w:t>
-      </w:r>
-      <w:proofErr w:type="gramStart"/>
-      <w:r>
-        <w:t>print(</w:t>
-      </w:r>
-      <w:proofErr w:type="gramEnd"/>
-      <w:r>
-        <w:t>'Step 4: last = ${</w:t>
-      </w:r>
-      <w:proofErr w:type="gramStart"/>
-      <w:r>
-        <w:t>log2.entries.last</w:t>
-      </w:r>
-      <w:proofErr w:type="gramEnd"/>
-      <w:r>
-        <w:t>}');</w:t>
+        <w:t>  print('Step 4: same object? ${identical(log1, log2)}');</w:t>
+      </w:r>
+    </w:p>
+    <w:p>
+      <w:r>
+        <w:t>  print('Step 4: entries = ${log1.entries.length}');</w:t>
+      </w:r>
+    </w:p>
+    <w:p>
+      <w:r>
+        <w:t>  print('Step 4: last = ${log2.entries.last}');</w:t>
       </w:r>
     </w:p>
     <w:p>
@@ -1885,7 +882,521 @@
         <w:t>STEP 5:</w:t>
       </w:r>
     </w:p>
-    <w:p/>
+    <w:p>
+      <w:r>
+        <w:t>class OrderLine {</w:t>
+      </w:r>
+    </w:p>
+    <w:p>
+      <w:r>
+        <w:t>  final MenuItem item;</w:t>
+      </w:r>
+    </w:p>
+    <w:p>
+      <w:r>
+        <w:t>  final int qty;</w:t>
+      </w:r>
+    </w:p>
+    <w:p>
+      <w:r>
+        <w:t>  final int total;</w:t>
+      </w:r>
+    </w:p>
+    <w:p>
+      <w:r>
+        <w:t>  final int tax;</w:t>
+      </w:r>
+    </w:p>
+    <w:p/>
+    <w:p>
+      <w:r>
+        <w:t>  OrderLine(this.item, this.qty)</w:t>
+      </w:r>
+    </w:p>
+    <w:p>
+      <w:r>
+        <w:t>      : total = item.price * qty,</w:t>
+      </w:r>
+    </w:p>
+    <w:p>
+      <w:r>
+        <w:t>        tax = item.price * qty * taxPercent ~/ 100,</w:t>
+      </w:r>
+    </w:p>
+    <w:p>
+      <w:r>
+        <w:t>        assert(qty &gt; 0, 'qty must be positive');</w:t>
+      </w:r>
+    </w:p>
+    <w:p>
+      <w:r>
+        <w:t>}</w:t>
+      </w:r>
+    </w:p>
+    <w:p/>
+    <w:p>
+      <w:r>
+        <w:t>OrderLine mainOrder() {</w:t>
+      </w:r>
+    </w:p>
+    <w:p>
+      <w:r>
+        <w:t>  return OrderLine(</w:t>
+      </w:r>
+    </w:p>
+    <w:p>
+      <w:r>
+        <w:t>    MenuItem(menu[u], priceOf(u)),</w:t>
+      </w:r>
+    </w:p>
+    <w:p>
+      <w:r>
+        <w:t>    2 + (t + u) % 5,</w:t>
+      </w:r>
+    </w:p>
+    <w:p>
+      <w:r>
+        <w:t>  );</w:t>
+      </w:r>
+    </w:p>
+    <w:p>
+      <w:r>
+        <w:t>}</w:t>
+      </w:r>
+    </w:p>
+    <w:p/>
+    <w:p/>
+    <w:p>
+      <w:r>
+        <w:t>void step5() {</w:t>
+      </w:r>
+    </w:p>
+    <w:p>
+      <w:r>
+        <w:t>  print('--- Step 5 ---');</w:t>
+      </w:r>
+    </w:p>
+    <w:p/>
+    <w:p>
+      <w:r>
+        <w:t>  final line = mainOrder();</w:t>
+      </w:r>
+    </w:p>
+    <w:p/>
+    <w:p>
+      <w:r>
+        <w:t>  print('Step 5: ${line.item.name} x${line.qty}');</w:t>
+      </w:r>
+    </w:p>
+    <w:p>
+      <w:r>
+        <w:t>  print('Step 5: total=${line.total} tax=${line.tax}');</w:t>
+      </w:r>
+    </w:p>
+    <w:p/>
+    <w:p>
+      <w:r>
+        <w:t>  try {</w:t>
+      </w:r>
+    </w:p>
+    <w:p>
+      <w:r>
+        <w:t>    OrderLine(line.item, 0);</w:t>
+      </w:r>
+    </w:p>
+    <w:p>
+      <w:r>
+        <w:t>    print('Step 5: assert did NOT fire');</w:t>
+      </w:r>
+    </w:p>
+    <w:p>
+      <w:r>
+        <w:t>  } on AssertionError {</w:t>
+      </w:r>
+    </w:p>
+    <w:p>
+      <w:r>
+        <w:t>    print('Step 5: assert fired');</w:t>
+      </w:r>
+    </w:p>
+    <w:p>
+      <w:r>
+        <w:t>  }</w:t>
+      </w:r>
+    </w:p>
+    <w:p>
+      <w:r>
+        <w:t>}</w:t>
+      </w:r>
+    </w:p>
+    <w:p/>
+    <w:p/>
+    <w:p>
+      <w:r>
+        <w:lastRenderedPageBreak/>
+        <w:drawing>
+          <wp:inline distT="0" distB="0" distL="0" distR="0" wp14:anchorId="0014E02B" wp14:editId="3BE8938F">
+            <wp:extent cx="4940554" cy="4426177"/>
+            <wp:effectExtent l="0" t="0" r="0" b="0"/>
+            <wp:docPr id="1716700725" name="Picture 1"/>
+            <wp:cNvGraphicFramePr>
+              <a:graphicFrameLocks xmlns:a="http://schemas.openxmlformats.org/drawingml/2006/main" noChangeAspect="1"/>
+            </wp:cNvGraphicFramePr>
+            <a:graphic xmlns:a="http://schemas.openxmlformats.org/drawingml/2006/main">
+              <a:graphicData uri="http://schemas.openxmlformats.org/drawingml/2006/picture">
+                <pic:pic xmlns:pic="http://schemas.openxmlformats.org/drawingml/2006/picture">
+                  <pic:nvPicPr>
+                    <pic:cNvPr id="1716700725" name=""/>
+                    <pic:cNvPicPr/>
+                  </pic:nvPicPr>
+                  <pic:blipFill>
+                    <a:blip r:embed="rId8"/>
+                    <a:stretch>
+                      <a:fillRect/>
+                    </a:stretch>
+                  </pic:blipFill>
+                  <pic:spPr>
+                    <a:xfrm>
+                      <a:off x="0" y="0"/>
+                      <a:ext cx="4940554" cy="4426177"/>
+                    </a:xfrm>
+                    <a:prstGeom prst="rect">
+                      <a:avLst/>
+                    </a:prstGeom>
+                  </pic:spPr>
+                </pic:pic>
+              </a:graphicData>
+            </a:graphic>
+          </wp:inline>
+        </w:drawing>
+      </w:r>
+    </w:p>
+    <w:p/>
+    <w:p/>
+    <w:p>
+      <w:r>
+        <w:t>STEP 6:</w:t>
+      </w:r>
+    </w:p>
+    <w:p>
+      <w:r>
+        <w:t>extension OrderLineGetters on OrderLine {</w:t>
+      </w:r>
+    </w:p>
+    <w:p>
+      <w:r>
+        <w:t>  int get grand =&gt; total + tax;</w:t>
+      </w:r>
+    </w:p>
+    <w:p/>
+    <w:p>
+      <w:r>
+        <w:t>  bool get isBigOrder =&gt; grand &gt; bigOrderLimit;</w:t>
+      </w:r>
+    </w:p>
+    <w:p/>
+    <w:p>
+      <w:r>
+        <w:t>  String get label =&gt; '${item.name} x$qty';</w:t>
+      </w:r>
+    </w:p>
+    <w:p>
+      <w:r>
+        <w:t>}</w:t>
+      </w:r>
+    </w:p>
+    <w:p/>
+    <w:p/>
+    <w:p/>
+    <w:p>
+      <w:r>
+        <w:t>void step6() {</w:t>
+      </w:r>
+    </w:p>
+    <w:p>
+      <w:r>
+        <w:t>  print('--- Step 6 ---');</w:t>
+      </w:r>
+    </w:p>
+    <w:p/>
+    <w:p>
+      <w:r>
+        <w:t>  final line = mainOrder();</w:t>
+      </w:r>
+    </w:p>
+    <w:p/>
+    <w:p>
+      <w:r>
+        <w:t>  print('Step 6: grand=${line.grand}');</w:t>
+      </w:r>
+    </w:p>
+    <w:p>
+      <w:r>
+        <w:t>  print(</w:t>
+      </w:r>
+    </w:p>
+    <w:p>
+      <w:r>
+        <w:t>    'Step 6: big order? ${line.isBigOrder} (limit $bigOrderLimit)',</w:t>
+      </w:r>
+    </w:p>
+    <w:p>
+      <w:r>
+        <w:t>  );</w:t>
+      </w:r>
+    </w:p>
+    <w:p>
+      <w:r>
+        <w:lastRenderedPageBreak/>
+        <w:t>  print('Step 6: label=${line.label}');</w:t>
+      </w:r>
+    </w:p>
+    <w:p>
+      <w:r>
+        <w:t>}</w:t>
+      </w:r>
+    </w:p>
+    <w:p/>
+    <w:p>
+      <w:r>
+        <w:drawing>
+          <wp:inline distT="0" distB="0" distL="0" distR="0" wp14:anchorId="374E271C" wp14:editId="4C3F39C8">
+            <wp:extent cx="5531134" cy="4559534"/>
+            <wp:effectExtent l="0" t="0" r="0" b="0"/>
+            <wp:docPr id="1857501377" name="Picture 1"/>
+            <wp:cNvGraphicFramePr>
+              <a:graphicFrameLocks xmlns:a="http://schemas.openxmlformats.org/drawingml/2006/main" noChangeAspect="1"/>
+            </wp:cNvGraphicFramePr>
+            <a:graphic xmlns:a="http://schemas.openxmlformats.org/drawingml/2006/main">
+              <a:graphicData uri="http://schemas.openxmlformats.org/drawingml/2006/picture">
+                <pic:pic xmlns:pic="http://schemas.openxmlformats.org/drawingml/2006/picture">
+                  <pic:nvPicPr>
+                    <pic:cNvPr id="1857501377" name=""/>
+                    <pic:cNvPicPr/>
+                  </pic:nvPicPr>
+                  <pic:blipFill>
+                    <a:blip r:embed="rId9"/>
+                    <a:stretch>
+                      <a:fillRect/>
+                    </a:stretch>
+                  </pic:blipFill>
+                  <pic:spPr>
+                    <a:xfrm>
+                      <a:off x="0" y="0"/>
+                      <a:ext cx="5531134" cy="4559534"/>
+                    </a:xfrm>
+                    <a:prstGeom prst="rect">
+                      <a:avLst/>
+                    </a:prstGeom>
+                  </pic:spPr>
+                </pic:pic>
+              </a:graphicData>
+            </a:graphic>
+          </wp:inline>
+        </w:drawing>
+      </w:r>
+    </w:p>
+    <w:p/>
+    <w:p>
+      <w:r>
+        <w:t>STEP 7:</w:t>
+      </w:r>
+    </w:p>
+    <w:p>
+      <w:r>
+        <w:t>class StudentCard {</w:t>
+      </w:r>
+    </w:p>
+    <w:p>
+      <w:r>
+        <w:t>  final String owner;</w:t>
+      </w:r>
+    </w:p>
+    <w:p>
+      <w:r>
+        <w:t>  int _balance;</w:t>
+      </w:r>
+    </w:p>
+    <w:p/>
+    <w:p>
+      <w:r>
+        <w:t>  StudentCard(this.owner) : _balance = 0;</w:t>
+      </w:r>
+    </w:p>
+    <w:p/>
+    <w:p>
+      <w:r>
+        <w:t>  int get balance =&gt; _balance;</w:t>
+      </w:r>
+    </w:p>
+    <w:p/>
+    <w:p>
+      <w:r>
+        <w:t>  set balance(int v) {</w:t>
+      </w:r>
+    </w:p>
+    <w:p>
+      <w:r>
+        <w:t>    if (v &lt; 0) {</w:t>
+      </w:r>
+    </w:p>
+    <w:p>
+      <w:r>
+        <w:t>      _balance = 0;</w:t>
+      </w:r>
+    </w:p>
+    <w:p>
+      <w:r>
+        <w:t>    } else if (v &gt; balanceCap) {</w:t>
+      </w:r>
+    </w:p>
+    <w:p>
+      <w:r>
+        <w:t>      _balance = balanceCap;</w:t>
+      </w:r>
+    </w:p>
+    <w:p>
+      <w:r>
+        <w:t>    } else {</w:t>
+      </w:r>
+    </w:p>
+    <w:p>
+      <w:r>
+        <w:t>      _balance = v;</w:t>
+      </w:r>
+    </w:p>
+    <w:p>
+      <w:r>
+        <w:t>    }</w:t>
+      </w:r>
+    </w:p>
+    <w:p>
+      <w:r>
+        <w:lastRenderedPageBreak/>
+        <w:t>  }</w:t>
+      </w:r>
+    </w:p>
+    <w:p>
+      <w:r>
+        <w:t>}</w:t>
+      </w:r>
+    </w:p>
+    <w:p/>
+    <w:p/>
+    <w:p/>
+    <w:p>
+      <w:r>
+        <w:t>void step7() {</w:t>
+      </w:r>
+    </w:p>
+    <w:p>
+      <w:r>
+        <w:t>  print('--- Step 7 ---');</w:t>
+      </w:r>
+    </w:p>
+    <w:p/>
+    <w:p>
+      <w:r>
+        <w:t>  final card = StudentCard('S$seed');</w:t>
+      </w:r>
+    </w:p>
+    <w:p/>
+    <w:p>
+      <w:r>
+        <w:t>  card.balance = seed * 10 + 50;</w:t>
+      </w:r>
+    </w:p>
+    <w:p>
+      <w:r>
+        <w:t>  print('Step 7: topped up -&gt; ${card.balance}');</w:t>
+      </w:r>
+    </w:p>
+    <w:p/>
+    <w:p>
+      <w:r>
+        <w:t>  card.balance = -seed - 1;</w:t>
+      </w:r>
+    </w:p>
+    <w:p>
+      <w:r>
+        <w:t>  print('Step 7: bad value -&gt; ${card.balance}');</w:t>
+      </w:r>
+    </w:p>
+    <w:p/>
+    <w:p>
+      <w:r>
+        <w:t>  card.balance = balanceCap - u;</w:t>
+      </w:r>
+    </w:p>
+    <w:p>
+      <w:r>
+        <w:t>  print('Step 7: reset -&gt; ${card.balance}');</w:t>
+      </w:r>
+    </w:p>
+    <w:p/>
+    <w:p>
+      <w:r>
+        <w:t>  card.balance = card.balance - mainOrder().grand;</w:t>
+      </w:r>
+    </w:p>
+    <w:p>
+      <w:r>
+        <w:t>  print('Step 7: paid order -&gt; ${card.balance}');</w:t>
+      </w:r>
+    </w:p>
+    <w:p>
+      <w:r>
+        <w:t>}</w:t>
+      </w:r>
+    </w:p>
+    <w:p/>
+    <w:p/>
+    <w:p>
+      <w:r>
+        <w:lastRenderedPageBreak/>
+        <w:drawing>
+          <wp:inline distT="0" distB="0" distL="0" distR="0" wp14:anchorId="4B2A70A0" wp14:editId="0CA6810A">
+            <wp:extent cx="5943600" cy="4518025"/>
+            <wp:effectExtent l="0" t="0" r="0" b="0"/>
+            <wp:docPr id="948573783" name="Picture 1"/>
+            <wp:cNvGraphicFramePr>
+              <a:graphicFrameLocks xmlns:a="http://schemas.openxmlformats.org/drawingml/2006/main" noChangeAspect="1"/>
+            </wp:cNvGraphicFramePr>
+            <a:graphic xmlns:a="http://schemas.openxmlformats.org/drawingml/2006/main">
+              <a:graphicData uri="http://schemas.openxmlformats.org/drawingml/2006/picture">
+                <pic:pic xmlns:pic="http://schemas.openxmlformats.org/drawingml/2006/picture">
+                  <pic:nvPicPr>
+                    <pic:cNvPr id="948573783" name=""/>
+                    <pic:cNvPicPr/>
+                  </pic:nvPicPr>
+                  <pic:blipFill>
+                    <a:blip r:embed="rId10"/>
+                    <a:stretch>
+                      <a:fillRect/>
+                    </a:stretch>
+                  </pic:blipFill>
+                  <pic:spPr>
+                    <a:xfrm>
+                      <a:off x="0" y="0"/>
+                      <a:ext cx="5943600" cy="4518025"/>
+                    </a:xfrm>
+                    <a:prstGeom prst="rect">
+                      <a:avLst/>
+                    </a:prstGeom>
+                  </pic:spPr>
+                </pic:pic>
+              </a:graphicData>
+            </a:graphic>
+          </wp:inline>
+        </w:drawing>
+      </w:r>
+    </w:p>
+    <w:p/>
+    <w:p>
+      <w:r>
+        <w:t>STEP 8:</w:t>
+      </w:r>
+    </w:p>
     <w:sectPr>
       <w:pgSz w:w="12240" w:h="15840"/>
       <w:pgMar w:top="1440" w:right="1440" w:bottom="1440" w:left="1440" w:header="720" w:footer="720" w:gutter="0"/>

</xml_diff>

<commit_message>
STEP 8,9 & 10
</commit_message>
<xml_diff>
--- a/lab3/Checkpoints.docx
+++ b/lab3/Checkpoints.docx
@@ -1395,6 +1395,630 @@
     <w:p>
       <w:r>
         <w:t>STEP 8:</w:t>
+      </w:r>
+    </w:p>
+    <w:p/>
+    <w:p>
+      <w:r>
+        <w:t>List&lt;MenuItem&gt; buildMenu() {</w:t>
+      </w:r>
+    </w:p>
+    <w:p>
+      <w:r>
+        <w:t>  return [</w:t>
+      </w:r>
+    </w:p>
+    <w:p>
+      <w:r>
+        <w:t>    for (int k = 0; k &lt; 4; k++)</w:t>
+      </w:r>
+    </w:p>
+    <w:p>
+      <w:r>
+        <w:t>      MenuItem.fromString(</w:t>
+      </w:r>
+    </w:p>
+    <w:p>
+      <w:r>
+        <w:t>        '${menu[(u + 3 * k) % 10]}:${priceOf((u + 3 * k) % 10)}',</w:t>
+      </w:r>
+    </w:p>
+    <w:p>
+      <w:r>
+        <w:t>      ),</w:t>
+      </w:r>
+    </w:p>
+    <w:p>
+      <w:r>
+        <w:t>  ];</w:t>
+      </w:r>
+    </w:p>
+    <w:p>
+      <w:r>
+        <w:t>}</w:t>
+      </w:r>
+    </w:p>
+    <w:p/>
+    <w:p>
+      <w:r>
+        <w:t>void step8() {</w:t>
+      </w:r>
+    </w:p>
+    <w:p>
+      <w:r>
+        <w:t>  print('--- Step 8 ---');</w:t>
+      </w:r>
+    </w:p>
+    <w:p/>
+    <w:p>
+      <w:r>
+        <w:t>  final items = buildMenu();</w:t>
+      </w:r>
+    </w:p>
+    <w:p/>
+    <w:p>
+      <w:r>
+        <w:t>  final priciest = items.reduce(</w:t>
+      </w:r>
+    </w:p>
+    <w:p>
+      <w:r>
+        <w:t>    (a, b) =&gt; a.price &gt; b.price ? a : b,</w:t>
+      </w:r>
+    </w:p>
+    <w:p>
+      <w:r>
+        <w:t>  );</w:t>
+      </w:r>
+    </w:p>
+    <w:p/>
+    <w:p>
+      <w:r>
+        <w:lastRenderedPageBreak/>
+        <w:t>  final sum = items.fold(</w:t>
+      </w:r>
+    </w:p>
+    <w:p>
+      <w:r>
+        <w:t>    0,</w:t>
+      </w:r>
+    </w:p>
+    <w:p>
+      <w:r>
+        <w:t>    (total, item) =&gt; total + item.price,</w:t>
+      </w:r>
+    </w:p>
+    <w:p>
+      <w:r>
+        <w:t>  );</w:t>
+      </w:r>
+    </w:p>
+    <w:p/>
+    <w:p>
+      <w:r>
+        <w:t>  print('Step 8: menu = $items');</w:t>
+      </w:r>
+    </w:p>
+    <w:p>
+      <w:r>
+        <w:t>  print('Step 8: priciest = ${priciest.name}');</w:t>
+      </w:r>
+    </w:p>
+    <w:p>
+      <w:r>
+        <w:t>  print('Step 8: sum = $sum');</w:t>
+      </w:r>
+    </w:p>
+    <w:p>
+      <w:r>
+        <w:t>}</w:t>
+      </w:r>
+    </w:p>
+    <w:p/>
+    <w:p>
+      <w:r>
+        <w:drawing>
+          <wp:inline distT="0" distB="0" distL="0" distR="0" wp14:anchorId="3486F133" wp14:editId="7053D5DF">
+            <wp:extent cx="5943600" cy="4259580"/>
+            <wp:effectExtent l="0" t="0" r="0" b="7620"/>
+            <wp:docPr id="1243183765" name="Picture 1"/>
+            <wp:cNvGraphicFramePr>
+              <a:graphicFrameLocks xmlns:a="http://schemas.openxmlformats.org/drawingml/2006/main" noChangeAspect="1"/>
+            </wp:cNvGraphicFramePr>
+            <a:graphic xmlns:a="http://schemas.openxmlformats.org/drawingml/2006/main">
+              <a:graphicData uri="http://schemas.openxmlformats.org/drawingml/2006/picture">
+                <pic:pic xmlns:pic="http://schemas.openxmlformats.org/drawingml/2006/picture">
+                  <pic:nvPicPr>
+                    <pic:cNvPr id="1243183765" name=""/>
+                    <pic:cNvPicPr/>
+                  </pic:nvPicPr>
+                  <pic:blipFill>
+                    <a:blip r:embed="rId11"/>
+                    <a:stretch>
+                      <a:fillRect/>
+                    </a:stretch>
+                  </pic:blipFill>
+                  <pic:spPr>
+                    <a:xfrm>
+                      <a:off x="0" y="0"/>
+                      <a:ext cx="5943600" cy="4259580"/>
+                    </a:xfrm>
+                    <a:prstGeom prst="rect">
+                      <a:avLst/>
+                    </a:prstGeom>
+                  </pic:spPr>
+                </pic:pic>
+              </a:graphicData>
+            </a:graphic>
+          </wp:inline>
+        </w:drawing>
+      </w:r>
+    </w:p>
+    <w:p/>
+    <w:p>
+      <w:r>
+        <w:t>STEP 9:</w:t>
+      </w:r>
+    </w:p>
+    <w:p/>
+    <w:p>
+      <w:r>
+        <w:t>List&lt;OrderLine&gt; buildReceipt() {</w:t>
+      </w:r>
+    </w:p>
+    <w:p>
+      <w:r>
+        <w:t>  final items = buildMenu();</w:t>
+      </w:r>
+    </w:p>
+    <w:p/>
+    <w:p>
+      <w:r>
+        <w:t>  return [</w:t>
+      </w:r>
+    </w:p>
+    <w:p>
+      <w:r>
+        <w:t>    for (int k = 0; k &lt; 3; k++)</w:t>
+      </w:r>
+    </w:p>
+    <w:p>
+      <w:r>
+        <w:t>      OrderLine(</w:t>
+      </w:r>
+    </w:p>
+    <w:p>
+      <w:r>
+        <w:t>        items[k],</w:t>
+      </w:r>
+    </w:p>
+    <w:p>
+      <w:r>
+        <w:t>        1 + (t + k) % 4,</w:t>
+      </w:r>
+    </w:p>
+    <w:p>
+      <w:r>
+        <w:t>      ),</w:t>
+      </w:r>
+    </w:p>
+    <w:p>
+      <w:r>
+        <w:t>  ];</w:t>
+      </w:r>
+    </w:p>
+    <w:p>
+      <w:r>
+        <w:lastRenderedPageBreak/>
+        <w:t>}</w:t>
+      </w:r>
+    </w:p>
+    <w:p/>
+    <w:p/>
+    <w:p>
+      <w:r>
+        <w:t>void step9() {</w:t>
+      </w:r>
+    </w:p>
+    <w:p>
+      <w:r>
+        <w:t>  print('--- Step 9 ---');</w:t>
+      </w:r>
+    </w:p>
+    <w:p/>
+    <w:p>
+      <w:r>
+        <w:t>  final receipt = buildReceipt();</w:t>
+      </w:r>
+    </w:p>
+    <w:p>
+      <w:r>
+        <w:t>  final log = OrderLog();</w:t>
+      </w:r>
+    </w:p>
+    <w:p>
+      <w:r>
+        <w:t>  var total = 0;</w:t>
+      </w:r>
+    </w:p>
+    <w:p/>
+    <w:p>
+      <w:r>
+        <w:t>  for (final line in receipt) {</w:t>
+      </w:r>
+    </w:p>
+    <w:p>
+      <w:r>
+        <w:t>    print('Step 9: ${line.label} = ${line.grand}');</w:t>
+      </w:r>
+    </w:p>
+    <w:p>
+      <w:r>
+        <w:t>    log.add('receipt: ${line.label}');</w:t>
+      </w:r>
+    </w:p>
+    <w:p>
+      <w:r>
+        <w:t>    total += line.grand;</w:t>
+      </w:r>
+    </w:p>
+    <w:p>
+      <w:r>
+        <w:t>  }</w:t>
+      </w:r>
+    </w:p>
+    <w:p/>
+    <w:p>
+      <w:r>
+        <w:t>  print('Step 9: receipt total = $total');</w:t>
+      </w:r>
+    </w:p>
+    <w:p>
+      <w:r>
+        <w:t>  print('Step 9: log size = ${OrderLog().entries.length}');</w:t>
+      </w:r>
+    </w:p>
+    <w:p>
+      <w:r>
+        <w:t>}</w:t>
+      </w:r>
+    </w:p>
+    <w:p/>
+    <w:p>
+      <w:r>
+        <w:drawing>
+          <wp:inline distT="0" distB="0" distL="0" distR="0" wp14:anchorId="7987DF98" wp14:editId="5057AA47">
+            <wp:extent cx="5943600" cy="4453255"/>
+            <wp:effectExtent l="0" t="0" r="0" b="4445"/>
+            <wp:docPr id="1951346973" name="Picture 1"/>
+            <wp:cNvGraphicFramePr>
+              <a:graphicFrameLocks xmlns:a="http://schemas.openxmlformats.org/drawingml/2006/main" noChangeAspect="1"/>
+            </wp:cNvGraphicFramePr>
+            <a:graphic xmlns:a="http://schemas.openxmlformats.org/drawingml/2006/main">
+              <a:graphicData uri="http://schemas.openxmlformats.org/drawingml/2006/picture">
+                <pic:pic xmlns:pic="http://schemas.openxmlformats.org/drawingml/2006/picture">
+                  <pic:nvPicPr>
+                    <pic:cNvPr id="1951346973" name=""/>
+                    <pic:cNvPicPr/>
+                  </pic:nvPicPr>
+                  <pic:blipFill>
+                    <a:blip r:embed="rId12"/>
+                    <a:stretch>
+                      <a:fillRect/>
+                    </a:stretch>
+                  </pic:blipFill>
+                  <pic:spPr>
+                    <a:xfrm>
+                      <a:off x="0" y="0"/>
+                      <a:ext cx="5943600" cy="4453255"/>
+                    </a:xfrm>
+                    <a:prstGeom prst="rect">
+                      <a:avLst/>
+                    </a:prstGeom>
+                  </pic:spPr>
+                </pic:pic>
+              </a:graphicData>
+            </a:graphic>
+          </wp:inline>
+        </w:drawing>
+      </w:r>
+    </w:p>
+    <w:p/>
+    <w:p>
+      <w:r>
+        <w:t>STEP 10:</w:t>
+      </w:r>
+    </w:p>
+    <w:p>
+      <w:r>
+        <w:lastRenderedPageBreak/>
+        <w:t>class Coupon {</w:t>
+      </w:r>
+    </w:p>
+    <w:p>
+      <w:r>
+        <w:t>  static final Map&lt;String, Coupon&gt; _cache = {};</w:t>
+      </w:r>
+    </w:p>
+    <w:p/>
+    <w:p>
+      <w:r>
+        <w:t>  final String code;</w:t>
+      </w:r>
+    </w:p>
+    <w:p>
+      <w:r>
+        <w:t>  final int percent;</w:t>
+      </w:r>
+    </w:p>
+    <w:p>
+      <w:r>
+        <w:t>  final int minSpend;</w:t>
+      </w:r>
+    </w:p>
+    <w:p/>
+    <w:p>
+      <w:r>
+        <w:t>  Coupon(this.code, this.percent)</w:t>
+      </w:r>
+    </w:p>
+    <w:p>
+      <w:r>
+        <w:t>      : minSpend = percent * 70,</w:t>
+      </w:r>
+    </w:p>
+    <w:p>
+      <w:r>
+        <w:t>        assert(percent &gt;= 1 &amp;&amp; percent &lt;= 50);</w:t>
+      </w:r>
+    </w:p>
+    <w:p/>
+    <w:p>
+      <w:r>
+        <w:t>  factory Coupon.fromCode(String code) {</w:t>
+      </w:r>
+    </w:p>
+    <w:p>
+      <w:r>
+        <w:t>    return _cache.putIfAbsent(</w:t>
+      </w:r>
+    </w:p>
+    <w:p>
+      <w:r>
+        <w:t>      code,</w:t>
+      </w:r>
+    </w:p>
+    <w:p>
+      <w:r>
+        <w:t>      () =&gt; Coupon(code, couponPercent),</w:t>
+      </w:r>
+    </w:p>
+    <w:p>
+      <w:r>
+        <w:t>    );</w:t>
+      </w:r>
+    </w:p>
+    <w:p>
+      <w:r>
+        <w:t>  }</w:t>
+      </w:r>
+    </w:p>
+    <w:p/>
+    <w:p>
+      <w:r>
+        <w:t>  int discountOn(int amount) {</w:t>
+      </w:r>
+    </w:p>
+    <w:p>
+      <w:r>
+        <w:t>    if (amount &gt;= minSpend) {</w:t>
+      </w:r>
+    </w:p>
+    <w:p>
+      <w:r>
+        <w:t>      return amount * percent ~/ 100;</w:t>
+      </w:r>
+    </w:p>
+    <w:p>
+      <w:r>
+        <w:t>    }</w:t>
+      </w:r>
+    </w:p>
+    <w:p>
+      <w:r>
+        <w:t>    return 0;</w:t>
+      </w:r>
+    </w:p>
+    <w:p>
+      <w:r>
+        <w:t>  }</w:t>
+      </w:r>
+    </w:p>
+    <w:p>
+      <w:r>
+        <w:t>}</w:t>
+      </w:r>
+    </w:p>
+    <w:p/>
+    <w:p>
+      <w:r>
+        <w:t>void step10() {</w:t>
+      </w:r>
+    </w:p>
+    <w:p>
+      <w:r>
+        <w:t>  print('--- Step 10 ---');</w:t>
+      </w:r>
+    </w:p>
+    <w:p/>
+    <w:p>
+      <w:r>
+        <w:t>  final code = 'CAFE${seed.toString().padLeft(2, '0')}';</w:t>
+      </w:r>
+    </w:p>
+    <w:p/>
+    <w:p>
+      <w:r>
+        <w:t>  final c1 = Coupon.fromCode(code);</w:t>
+      </w:r>
+    </w:p>
+    <w:p>
+      <w:r>
+        <w:t>  final c2 = Coupon.fromCode(code);</w:t>
+      </w:r>
+    </w:p>
+    <w:p/>
+    <w:p>
+      <w:r>
+        <w:t>  final receipt = buildReceipt().fold(</w:t>
+      </w:r>
+    </w:p>
+    <w:p>
+      <w:r>
+        <w:t>    0,</w:t>
+      </w:r>
+    </w:p>
+    <w:p>
+      <w:r>
+        <w:t>    (total, line) =&gt; total + line.grand,</w:t>
+      </w:r>
+    </w:p>
+    <w:p>
+      <w:r>
+        <w:t>  );</w:t>
+      </w:r>
+    </w:p>
+    <w:p/>
+    <w:p>
+      <w:r>
+        <w:t>  final discount = c1.discountOn(receipt);</w:t>
+      </w:r>
+    </w:p>
+    <w:p/>
+    <w:p>
+      <w:r>
+        <w:t>  print(</w:t>
+      </w:r>
+    </w:p>
+    <w:p>
+      <w:r>
+        <w:t>    'Step 10: $code gives ${c1.percent}% off, min spend ${c1.minSpend}',</w:t>
+      </w:r>
+    </w:p>
+    <w:p>
+      <w:r>
+        <w:t>  );</w:t>
+      </w:r>
+    </w:p>
+    <w:p>
+      <w:r>
+        <w:t>  print('Step 10: cached? ${identical(c1, c2)}');</w:t>
+      </w:r>
+    </w:p>
+    <w:p>
+      <w:r>
+        <w:t>  print(</w:t>
+      </w:r>
+    </w:p>
+    <w:p>
+      <w:r>
+        <w:t>    'Step 10: receipt $receipt, discount $discount, payable ${receipt - discount}',</w:t>
+      </w:r>
+    </w:p>
+    <w:p>
+      <w:r>
+        <w:t>  );</w:t>
+      </w:r>
+    </w:p>
+    <w:p>
+      <w:r>
+        <w:lastRenderedPageBreak/>
+        <w:t>}</w:t>
+      </w:r>
+    </w:p>
+    <w:p>
+      <w:r>
+        <w:drawing>
+          <wp:inline distT="0" distB="0" distL="0" distR="0" wp14:anchorId="6C0BA6F1" wp14:editId="6E86DBC4">
+            <wp:extent cx="5943600" cy="4095750"/>
+            <wp:effectExtent l="0" t="0" r="0" b="0"/>
+            <wp:docPr id="989001820" name="Picture 1"/>
+            <wp:cNvGraphicFramePr>
+              <a:graphicFrameLocks xmlns:a="http://schemas.openxmlformats.org/drawingml/2006/main" noChangeAspect="1"/>
+            </wp:cNvGraphicFramePr>
+            <a:graphic xmlns:a="http://schemas.openxmlformats.org/drawingml/2006/main">
+              <a:graphicData uri="http://schemas.openxmlformats.org/drawingml/2006/picture">
+                <pic:pic xmlns:pic="http://schemas.openxmlformats.org/drawingml/2006/picture">
+                  <pic:nvPicPr>
+                    <pic:cNvPr id="989001820" name=""/>
+                    <pic:cNvPicPr/>
+                  </pic:nvPicPr>
+                  <pic:blipFill>
+                    <a:blip r:embed="rId13"/>
+                    <a:stretch>
+                      <a:fillRect/>
+                    </a:stretch>
+                  </pic:blipFill>
+                  <pic:spPr>
+                    <a:xfrm>
+                      <a:off x="0" y="0"/>
+                      <a:ext cx="5943600" cy="4095750"/>
+                    </a:xfrm>
+                    <a:prstGeom prst="rect">
+                      <a:avLst/>
+                    </a:prstGeom>
+                  </pic:spPr>
+                </pic:pic>
+              </a:graphicData>
+            </a:graphic>
+          </wp:inline>
+        </w:drawing>
+      </w:r>
+    </w:p>
+    <w:p/>
+    <w:p>
+      <w:r>
+        <w:t>WRAP UP:</w:t>
+      </w:r>
+    </w:p>
+    <w:p/>
+    <w:p>
+      <w:r>
+        <w:drawing>
+          <wp:inline distT="0" distB="0" distL="0" distR="0" wp14:anchorId="5564501F" wp14:editId="04629300">
+            <wp:extent cx="4845299" cy="2457576"/>
+            <wp:effectExtent l="0" t="0" r="0" b="0"/>
+            <wp:docPr id="201243306" name="Picture 1"/>
+            <wp:cNvGraphicFramePr>
+              <a:graphicFrameLocks xmlns:a="http://schemas.openxmlformats.org/drawingml/2006/main" noChangeAspect="1"/>
+            </wp:cNvGraphicFramePr>
+            <a:graphic xmlns:a="http://schemas.openxmlformats.org/drawingml/2006/main">
+              <a:graphicData uri="http://schemas.openxmlformats.org/drawingml/2006/picture">
+                <pic:pic xmlns:pic="http://schemas.openxmlformats.org/drawingml/2006/picture">
+                  <pic:nvPicPr>
+                    <pic:cNvPr id="201243306" name=""/>
+                    <pic:cNvPicPr/>
+                  </pic:nvPicPr>
+                  <pic:blipFill>
+                    <a:blip r:embed="rId14"/>
+                    <a:stretch>
+                      <a:fillRect/>
+                    </a:stretch>
+                  </pic:blipFill>
+                  <pic:spPr>
+                    <a:xfrm>
+                      <a:off x="0" y="0"/>
+                      <a:ext cx="4845299" cy="2457576"/>
+                    </a:xfrm>
+                    <a:prstGeom prst="rect">
+                      <a:avLst/>
+                    </a:prstGeom>
+                  </pic:spPr>
+                </pic:pic>
+              </a:graphicData>
+            </a:graphic>
+          </wp:inline>
+        </w:drawing>
       </w:r>
     </w:p>
     <w:sectPr>

</xml_diff>